<commit_message>
Doku: Leitungen an U1 sind in der PCB-Datei bereits verlegt
Die Angabe '20 offene Verbindungen an U1' stammte aus der Notiz zum
KiCad-ZIP und passt nicht zur PCB-Datei: jeder belegte U1-Pin hat eine
Leiterbahn mit passendem Netz. README, README-hardware sowie
Projektbeschreibung.docx und Hardware-Beschreibung_C3_S3.docx angepasst;
als offener Punkt bleibt der DRC in KiCad.

Co-Authored-By: Claude Opus 5.5 (1M context) <noreply@anthropic.com>
Claude-Session: https://claude.ai/code/session_01DMsk82yDs4uvyAGpWWFEQL
</commit_message>
<xml_diff>
--- a/docs/Projektbeschreibung.docx
+++ b/docs/Projektbeschreibung.docx
@@ -47,7 +47,7 @@
         <w:spacing w:after="120"/>
       </w:pPr>
       <w:r>
-        <w:t xml:space="preserve">Gleiche Funktion wie die C3-Variante, aber mit dem ESP32-S3-Zero und einem dritten UART. Das PCB wurde vom C3-Layout uebernommen, nur die Leitungen am ESP32 muessen neu geroutet werden.</w:t>
+        <w:t xml:space="preserve">Gleiche Funktion wie die C3-Variante, aber mit dem ESP32-S3-Zero und einem dritten UART. Das PCB wurde vom C3-Layout uebernommen, die Leitungen am ESP32 sind neu verlegt (DRC steht noch aus).</w:t>
       </w:r>
     </w:p>
     <w:p>
@@ -776,7 +776,7 @@
         </w:numPr>
       </w:pPr>
       <w:r>
-        <w:t xml:space="preserve">Hardware: Schaltplan fertig, PCB uebernommen. 20 Verbindungen an U1 sind noch nicht geroutet, J6 nur vorlaeufig platziert.</w:t>
+        <w:t xml:space="preserve">Hardware: Schaltplan fertig, PCB vom C3 uebernommen und an U1 neu verlegt. DRC in KiCad steht noch aus, J6 nur vorlaeufig platziert.</w:t>
       </w:r>
     </w:p>
     <w:p>
@@ -808,7 +808,7 @@
         </w:numPr>
       </w:pPr>
       <w:r>
-        <w:t xml:space="preserve">Leiterbahnen an U1 routen, danach DRC</w:t>
+        <w:t xml:space="preserve">DRC in KiCad ausfuehren (an U1 sind laut PCB-Datei alle Anschluesse verlegt)</w:t>
       </w:r>
     </w:p>
     <w:p>

</xml_diff>